<commit_message>
docs: finalize MOFI acceptance dossier
</commit_message>
<xml_diff>
--- a/docs/word/MOFI_Ho_so_du_an_va_huong_dan_su_dung.docx
+++ b/docs/word/MOFI_Ho_so_du_an_va_huong_dan_su_dung.docx
@@ -7019,7 +7019,7 @@
                 <w:color w:val="172B4D"/>
                 <w:sz w:val="18"/>
               </w:rPr>
-              <w:t>Có test riêng; không tính vào SQLite run</w:t>
+              <w:t>1 test; 18 assertions; đạt ở native và emulated prepares</w:t>
             </w:r>
           </w:p>
         </w:tc>
@@ -7045,7 +7045,7 @@
                 <w:color w:val="172B4D"/>
                 <w:sz w:val="18"/>
               </w:rPr>
-              <w:t>Cần chạy khi bật cờ và trỏ vào database kiểm thử PostgreSQL riêng; không chạy destructive test trên DB demo dùng chung.</w:t>
+              <w:t>Đã chạy trên cluster PostgreSQL disposable local 127.0.0.1:55439; không chạy destructive test trên DB demo dùng chung.</w:t>
             </w:r>
           </w:p>
         </w:tc>

</xml_diff>

<commit_message>
fix: roll demo market sessions into next business day
</commit_message>
<xml_diff>
--- a/docs/word/MOFI_Ho_so_du_an_va_huong_dan_su_dung.docx
+++ b/docs/word/MOFI_Ho_so_du_an_va_huong_dan_su_dung.docx
@@ -4956,7 +4956,7 @@
           <w:rFonts w:ascii="Arial" w:hAnsi="Arial" w:eastAsia="Arial"/>
           <w:color w:val="172B4D"/>
         </w:rPr>
-        <w:t>Một phiên demo gồm các tick từ 09:00 đến 11:25 và 13:00 đến 14:55 theo ngày mô phỏng, tổng cộng 54 tick với cấu hình hiện tại. Mỗi tick tăng 5 phút mô phỏng sau 5 giây thực. Khi hết tick, server chuyển phiên sang CLOSED và khóa nút đặt lệnh, tương tự trạng thái đóng cửa thị trường; việc mở phiên ngày khác là thao tác vận hành demo, không tự sửa lịch sử đã ghi.</w:t>
+        <w:t>Một phiên demo gồm các tick từ 09:00 đến 11:25 và 13:00 đến 14:55 theo ngày mô phỏng, tổng cộng 54 tick với cấu hình hiện tại. Mỗi tick tăng 5 phút mô phỏng sau 5 giây thực; frontend polling mỗi 2 giây nhưng server mới là nguồn quyết định tick. Khi hết tick, server đóng session, hủy lệnh trong ngày chưa khớp, giải phóng reservation và tự mở ngày làm việc kế tiếp ở tick 0; lịch sử execution không bị xóa.</w:t>
       </w:r>
     </w:p>
     <w:p>
@@ -6770,7 +6770,7 @@
                 <w:color w:val="172B4D"/>
                 <w:sz w:val="18"/>
               </w:rPr>
-              <w:t>66 tests; 65 passed; 1 skipped; 935 assertions</w:t>
+              <w:t>67 tests; 66 passed; 1 skipped; 945 assertions</w:t>
             </w:r>
           </w:p>
         </w:tc>
@@ -6796,7 +6796,7 @@
                 <w:color w:val="172B4D"/>
                 <w:sz w:val="18"/>
               </w:rPr>
-              <w:t>Luồng auth, ownership, ledger, orders, quote board và workspace đã có kiểm thử; 1 test được skip theo điều kiện môi trường.</w:t>
+              <w:t>Luồng auth, ownership, ledger, orders, quote board, rollover ngày và workspace đã có kiểm thử; 1 test được skip theo điều kiện môi trường.</w:t>
             </w:r>
           </w:p>
         </w:tc>

</xml_diff>